<commit_message>
actualizacion formatos UVP, imganes
</commit_message>
<xml_diff>
--- a/Inputs/Templates/GRI DHL.docx
+++ b/Inputs/Templates/GRI DHL.docx
@@ -76,7 +76,6 @@
           <w:lang w:val="es-ES" w:eastAsia="es-ES"/>
         </w:rPr>
       </w:pPr>
-      <w:proofErr w:type="gramStart"/>
       <w:r>
         <w:rPr>
           <w:rFonts w:eastAsia="Times New Roman" w:cstheme="minorHAnsi"/>
@@ -86,43 +85,7 @@
           <w:szCs w:val="24"/>
           <w:lang w:val="es-ES" w:eastAsia="es-ES"/>
         </w:rPr>
-        <w:t xml:space="preserve">{{ </w:t>
-      </w:r>
-      <w:proofErr w:type="spellStart"/>
-      <w:r>
-        <w:rPr>
-          <w:rFonts w:eastAsia="Times New Roman" w:cstheme="minorHAnsi"/>
-          <w:b/>
-          <w:bCs/>
-          <w:sz w:val="24"/>
-          <w:szCs w:val="24"/>
-          <w:lang w:val="es-ES" w:eastAsia="es-ES"/>
-        </w:rPr>
-        <w:t>razon</w:t>
-      </w:r>
-      <w:proofErr w:type="gramEnd"/>
-      <w:r>
-        <w:rPr>
-          <w:rFonts w:eastAsia="Times New Roman" w:cstheme="minorHAnsi"/>
-          <w:b/>
-          <w:bCs/>
-          <w:sz w:val="24"/>
-          <w:szCs w:val="24"/>
-          <w:lang w:val="es-ES" w:eastAsia="es-ES"/>
-        </w:rPr>
-        <w:t>_social</w:t>
-      </w:r>
-      <w:proofErr w:type="spellEnd"/>
-      <w:r>
-        <w:rPr>
-          <w:rFonts w:eastAsia="Times New Roman" w:cstheme="minorHAnsi"/>
-          <w:b/>
-          <w:bCs/>
-          <w:sz w:val="24"/>
-          <w:szCs w:val="24"/>
-          <w:lang w:val="es-ES" w:eastAsia="es-ES"/>
-        </w:rPr>
-        <w:t xml:space="preserve"> }}</w:t>
+        <w:t>{{ razon_social }}</w:t>
       </w:r>
     </w:p>
     <w:p>
@@ -187,33 +150,13 @@
           <w:lang w:val="es-ES"/>
         </w:rPr>
       </w:pPr>
-      <w:proofErr w:type="gramStart"/>
       <w:r>
         <w:rPr>
           <w:b/>
           <w:sz w:val="24"/>
           <w:szCs w:val="24"/>
         </w:rPr>
-        <w:t xml:space="preserve">{{ </w:t>
-      </w:r>
-      <w:proofErr w:type="spellStart"/>
-      <w:r>
-        <w:rPr>
-          <w:b/>
-          <w:sz w:val="24"/>
-          <w:szCs w:val="24"/>
-        </w:rPr>
-        <w:t>Direccion</w:t>
-      </w:r>
-      <w:proofErr w:type="spellEnd"/>
-      <w:proofErr w:type="gramEnd"/>
-      <w:r>
-        <w:rPr>
-          <w:b/>
-          <w:sz w:val="24"/>
-          <w:szCs w:val="24"/>
-        </w:rPr>
-        <w:t xml:space="preserve"> }}</w:t>
+        <w:t>{{ Direccion }}</w:t>
       </w:r>
     </w:p>
     <w:p>
@@ -279,41 +222,13 @@
           <w:szCs w:val="24"/>
         </w:rPr>
       </w:pPr>
-      <w:proofErr w:type="gramStart"/>
       <w:r>
         <w:rPr>
           <w:b/>
           <w:sz w:val="24"/>
           <w:szCs w:val="24"/>
         </w:rPr>
-        <w:t xml:space="preserve">{{ </w:t>
-      </w:r>
-      <w:proofErr w:type="spellStart"/>
-      <w:r>
-        <w:rPr>
-          <w:b/>
-          <w:sz w:val="24"/>
-          <w:szCs w:val="24"/>
-        </w:rPr>
-        <w:t>descripcion</w:t>
-      </w:r>
-      <w:proofErr w:type="gramEnd"/>
-      <w:r>
-        <w:rPr>
-          <w:b/>
-          <w:sz w:val="24"/>
-          <w:szCs w:val="24"/>
-        </w:rPr>
-        <w:t>_actividades</w:t>
-      </w:r>
-      <w:proofErr w:type="spellEnd"/>
-      <w:r>
-        <w:rPr>
-          <w:b/>
-          <w:sz w:val="24"/>
-          <w:szCs w:val="24"/>
-        </w:rPr>
-        <w:t xml:space="preserve"> }}</w:t>
+        <w:t>{{ descripcion_actividades }}</w:t>
       </w:r>
     </w:p>
     <w:p>
@@ -387,7 +302,6 @@
         </w:rPr>
         <w:t xml:space="preserve">SE CUENTA CON </w:t>
       </w:r>
-      <w:proofErr w:type="gramStart"/>
       <w:r>
         <w:rPr>
           <w:b/>
@@ -395,17 +309,7 @@
           <w:sz w:val="24"/>
           <w:szCs w:val="24"/>
         </w:rPr>
-        <w:t>{{ trabajadores</w:t>
-      </w:r>
-      <w:proofErr w:type="gramEnd"/>
-      <w:r>
-        <w:rPr>
-          <w:b/>
-          <w:bCs/>
-          <w:sz w:val="24"/>
-          <w:szCs w:val="24"/>
-        </w:rPr>
-        <w:t xml:space="preserve"> }}</w:t>
+        <w:t>{{ trabajadores }}</w:t>
       </w:r>
       <w:r>
         <w:rPr>
@@ -432,7 +336,7 @@
           <w:sz w:val="24"/>
           <w:szCs w:val="24"/>
         </w:rPr>
-        <w:t xml:space="preserve"> TURNOS</w:t>
+        <w:t xml:space="preserve"> TURNO</w:t>
       </w:r>
     </w:p>
     <w:p>
@@ -525,7 +429,6 @@
         </w:rPr>
         <w:t xml:space="preserve">: </w:t>
       </w:r>
-      <w:proofErr w:type="gramStart"/>
       <w:r>
         <w:rPr>
           <w:b/>
@@ -533,17 +436,7 @@
           <w:sz w:val="24"/>
           <w:szCs w:val="24"/>
         </w:rPr>
-        <w:t>{{ proveedores</w:t>
-      </w:r>
-      <w:proofErr w:type="gramEnd"/>
-      <w:r>
-        <w:rPr>
-          <w:b/>
-          <w:bCs/>
-          <w:sz w:val="24"/>
-          <w:szCs w:val="24"/>
-        </w:rPr>
-        <w:t xml:space="preserve"> }}</w:t>
+        <w:t>{{ proveedores }}</w:t>
       </w:r>
     </w:p>
     <w:p>
@@ -578,7 +471,6 @@
         </w:rPr>
         <w:t xml:space="preserve"> </w:t>
       </w:r>
-      <w:proofErr w:type="gramStart"/>
       <w:r>
         <w:rPr>
           <w:b/>
@@ -586,17 +478,7 @@
           <w:sz w:val="24"/>
           <w:szCs w:val="24"/>
         </w:rPr>
-        <w:t>{{ visitantes</w:t>
-      </w:r>
-      <w:proofErr w:type="gramEnd"/>
-      <w:r>
-        <w:rPr>
-          <w:b/>
-          <w:bCs/>
-          <w:sz w:val="24"/>
-          <w:szCs w:val="24"/>
-        </w:rPr>
-        <w:t xml:space="preserve"> }}</w:t>
+        <w:t>{{ visitantes }}</w:t>
       </w:r>
       <w:r>
         <w:rPr>
@@ -677,23 +559,13 @@
         </w:rPr>
         <w:t xml:space="preserve">DE </w:t>
       </w:r>
-      <w:proofErr w:type="gramStart"/>
       <w:r>
         <w:rPr>
           <w:b/>
           <w:sz w:val="24"/>
           <w:szCs w:val="24"/>
         </w:rPr>
-        <w:t>{{ construccion</w:t>
-      </w:r>
-      <w:proofErr w:type="gramEnd"/>
-      <w:r>
-        <w:rPr>
-          <w:b/>
-          <w:sz w:val="24"/>
-          <w:szCs w:val="24"/>
-        </w:rPr>
-        <w:t>_m2 }}</w:t>
+        <w:t>{{ construccion_m2 }}</w:t>
       </w:r>
       <w:r>
         <w:rPr>
@@ -910,7 +782,6 @@
                 <w:lang w:eastAsia="es-MX"/>
               </w:rPr>
             </w:pPr>
-            <w:proofErr w:type="gramStart"/>
             <w:r>
               <w:rPr>
                 <w:rFonts w:ascii="Calibri" w:eastAsia="Times New Roman" w:hAnsi="Calibri" w:cs="Calibri"/>
@@ -921,46 +792,7 @@
                 <w:szCs w:val="18"/>
                 <w:lang w:eastAsia="es-MX"/>
               </w:rPr>
-              <w:t xml:space="preserve">{{ </w:t>
-            </w:r>
-            <w:proofErr w:type="spellStart"/>
-            <w:r>
-              <w:rPr>
-                <w:rFonts w:ascii="Calibri" w:eastAsia="Times New Roman" w:hAnsi="Calibri" w:cs="Calibri"/>
-                <w:b/>
-                <w:bCs/>
-                <w:color w:val="000000"/>
-                <w:sz w:val="18"/>
-                <w:szCs w:val="18"/>
-                <w:lang w:eastAsia="es-MX"/>
-              </w:rPr>
-              <w:t>razon</w:t>
-            </w:r>
-            <w:proofErr w:type="gramEnd"/>
-            <w:r>
-              <w:rPr>
-                <w:rFonts w:ascii="Calibri" w:eastAsia="Times New Roman" w:hAnsi="Calibri" w:cs="Calibri"/>
-                <w:b/>
-                <w:bCs/>
-                <w:color w:val="000000"/>
-                <w:sz w:val="18"/>
-                <w:szCs w:val="18"/>
-                <w:lang w:eastAsia="es-MX"/>
-              </w:rPr>
-              <w:t>_social</w:t>
-            </w:r>
-            <w:proofErr w:type="spellEnd"/>
-            <w:r>
-              <w:rPr>
-                <w:rFonts w:ascii="Calibri" w:eastAsia="Times New Roman" w:hAnsi="Calibri" w:cs="Calibri"/>
-                <w:b/>
-                <w:bCs/>
-                <w:color w:val="000000"/>
-                <w:sz w:val="18"/>
-                <w:szCs w:val="18"/>
-                <w:lang w:eastAsia="es-MX"/>
-              </w:rPr>
-              <w:t xml:space="preserve"> }}</w:t>
+              <w:t>{{ razon_social }}</w:t>
             </w:r>
           </w:p>
         </w:tc>
@@ -1042,7 +874,6 @@
                 <w:lang w:eastAsia="es-MX"/>
               </w:rPr>
             </w:pPr>
-            <w:proofErr w:type="gramStart"/>
             <w:r>
               <w:rPr>
                 <w:rFonts w:ascii="Calibri" w:eastAsia="Times New Roman" w:hAnsi="Calibri" w:cs="Calibri"/>
@@ -1055,7 +886,6 @@
               </w:rPr>
               <w:t xml:space="preserve">{{ </w:t>
             </w:r>
-            <w:proofErr w:type="spellStart"/>
             <w:r>
               <w:rPr>
                 <w:rFonts w:ascii="Calibri" w:eastAsia="Times New Roman" w:hAnsi="Calibri" w:cs="Calibri"/>
@@ -1066,21 +896,7 @@
                 <w:szCs w:val="18"/>
                 <w:lang w:eastAsia="es-MX"/>
               </w:rPr>
-              <w:t>Direccion</w:t>
-            </w:r>
-            <w:proofErr w:type="spellEnd"/>
-            <w:proofErr w:type="gramEnd"/>
-            <w:r>
-              <w:rPr>
-                <w:rFonts w:ascii="Calibri" w:eastAsia="Times New Roman" w:hAnsi="Calibri" w:cs="Calibri"/>
-                <w:b/>
-                <w:bCs/>
-                <w:color w:val="000000"/>
-                <w:sz w:val="18"/>
-                <w:szCs w:val="18"/>
-                <w:lang w:eastAsia="es-MX"/>
-              </w:rPr>
-              <w:t xml:space="preserve"> </w:t>
+              <w:t xml:space="preserve">Direccion </w:t>
             </w:r>
             <w:r>
               <w:rPr>
@@ -1174,7 +990,6 @@
                 <w:lang w:eastAsia="es-MX"/>
               </w:rPr>
             </w:pPr>
-            <w:proofErr w:type="gramStart"/>
             <w:r>
               <w:rPr>
                 <w:rFonts w:ascii="Calibri" w:eastAsia="Times New Roman" w:hAnsi="Calibri" w:cs="Calibri"/>
@@ -1185,46 +1000,7 @@
                 <w:szCs w:val="18"/>
                 <w:lang w:eastAsia="es-MX"/>
               </w:rPr>
-              <w:t xml:space="preserve">{{ </w:t>
-            </w:r>
-            <w:proofErr w:type="spellStart"/>
-            <w:r>
-              <w:rPr>
-                <w:rFonts w:ascii="Calibri" w:eastAsia="Times New Roman" w:hAnsi="Calibri" w:cs="Calibri"/>
-                <w:b/>
-                <w:bCs/>
-                <w:color w:val="000000"/>
-                <w:sz w:val="18"/>
-                <w:szCs w:val="18"/>
-                <w:lang w:eastAsia="es-MX"/>
-              </w:rPr>
-              <w:t>giro</w:t>
-            </w:r>
-            <w:proofErr w:type="gramEnd"/>
-            <w:r>
-              <w:rPr>
-                <w:rFonts w:ascii="Calibri" w:eastAsia="Times New Roman" w:hAnsi="Calibri" w:cs="Calibri"/>
-                <w:b/>
-                <w:bCs/>
-                <w:color w:val="000000"/>
-                <w:sz w:val="18"/>
-                <w:szCs w:val="18"/>
-                <w:lang w:eastAsia="es-MX"/>
-              </w:rPr>
-              <w:t>_comercial</w:t>
-            </w:r>
-            <w:proofErr w:type="spellEnd"/>
-            <w:r>
-              <w:rPr>
-                <w:rFonts w:ascii="Calibri" w:eastAsia="Times New Roman" w:hAnsi="Calibri" w:cs="Calibri"/>
-                <w:b/>
-                <w:bCs/>
-                <w:color w:val="000000"/>
-                <w:sz w:val="18"/>
-                <w:szCs w:val="18"/>
-                <w:lang w:eastAsia="es-MX"/>
-              </w:rPr>
-              <w:t xml:space="preserve"> }}</w:t>
+              <w:t>{{ giro_comercial }}</w:t>
             </w:r>
           </w:p>
         </w:tc>
@@ -1260,49 +1036,15 @@
                 <w:lang w:eastAsia="es-MX"/>
               </w:rPr>
             </w:pPr>
-            <w:proofErr w:type="gramStart"/>
-            <w:r>
-              <w:rPr>
-                <w:rFonts w:ascii="Calibri" w:eastAsia="Times New Roman" w:hAnsi="Calibri" w:cs="Calibri"/>
-                <w:color w:val="000000"/>
-                <w:sz w:val="18"/>
-                <w:szCs w:val="18"/>
-                <w:lang w:eastAsia="es-MX"/>
-              </w:rPr>
-              <w:t xml:space="preserve">{{ </w:t>
-            </w:r>
-            <w:proofErr w:type="spellStart"/>
-            <w:r>
-              <w:rPr>
-                <w:rFonts w:ascii="Calibri" w:eastAsia="Times New Roman" w:hAnsi="Calibri" w:cs="Calibri"/>
-                <w:color w:val="000000"/>
-                <w:sz w:val="18"/>
-                <w:szCs w:val="18"/>
-                <w:lang w:eastAsia="es-MX"/>
-              </w:rPr>
-              <w:t>nombre</w:t>
-            </w:r>
-            <w:proofErr w:type="gramEnd"/>
-            <w:r>
-              <w:rPr>
-                <w:rFonts w:ascii="Calibri" w:eastAsia="Times New Roman" w:hAnsi="Calibri" w:cs="Calibri"/>
-                <w:color w:val="000000"/>
-                <w:sz w:val="18"/>
-                <w:szCs w:val="18"/>
-                <w:lang w:eastAsia="es-MX"/>
-              </w:rPr>
-              <w:t>_comercial</w:t>
-            </w:r>
-            <w:proofErr w:type="spellEnd"/>
-            <w:r>
-              <w:rPr>
-                <w:rFonts w:ascii="Calibri" w:eastAsia="Times New Roman" w:hAnsi="Calibri" w:cs="Calibri"/>
-                <w:color w:val="000000"/>
-                <w:sz w:val="18"/>
-                <w:szCs w:val="18"/>
-                <w:lang w:eastAsia="es-MX"/>
-              </w:rPr>
-              <w:t xml:space="preserve"> }}</w:t>
+            <w:r>
+              <w:rPr>
+                <w:rFonts w:ascii="Calibri" w:eastAsia="Times New Roman" w:hAnsi="Calibri" w:cs="Calibri"/>
+                <w:color w:val="000000"/>
+                <w:sz w:val="18"/>
+                <w:szCs w:val="18"/>
+                <w:lang w:eastAsia="es-MX"/>
+              </w:rPr>
+              <w:t>{{ nombre_comercial }}</w:t>
             </w:r>
           </w:p>
         </w:tc>
@@ -2115,7 +1857,6 @@
                 <w:lang w:eastAsia="es-MX"/>
               </w:rPr>
             </w:pPr>
-            <w:proofErr w:type="gramStart"/>
             <w:r>
               <w:rPr>
                 <w:rFonts w:ascii="Calibri" w:eastAsia="Times New Roman" w:hAnsi="Calibri" w:cs="Calibri"/>
@@ -2126,29 +1867,16 @@
               </w:rPr>
               <w:t xml:space="preserve">{{ </w:t>
             </w:r>
-            <w:proofErr w:type="spellStart"/>
-            <w:r>
-              <w:rPr>
-                <w:rFonts w:ascii="Calibri" w:eastAsia="Times New Roman" w:hAnsi="Calibri" w:cs="Calibri"/>
-                <w:color w:val="000000"/>
-                <w:sz w:val="18"/>
-                <w:szCs w:val="18"/>
-                <w:lang w:eastAsia="es-MX"/>
-              </w:rPr>
-              <w:t>descripcion</w:t>
-            </w:r>
-            <w:proofErr w:type="gramEnd"/>
-            <w:r>
-              <w:rPr>
-                <w:rFonts w:ascii="Calibri" w:eastAsia="Times New Roman" w:hAnsi="Calibri" w:cs="Calibri"/>
-                <w:color w:val="000000"/>
-                <w:sz w:val="18"/>
-                <w:szCs w:val="18"/>
-                <w:lang w:eastAsia="es-MX"/>
-              </w:rPr>
-              <w:t>_gas_inflamable</w:t>
-            </w:r>
-            <w:proofErr w:type="spellEnd"/>
+            <w:r>
+              <w:rPr>
+                <w:rFonts w:ascii="Calibri" w:eastAsia="Times New Roman" w:hAnsi="Calibri" w:cs="Calibri"/>
+                <w:color w:val="000000"/>
+                <w:sz w:val="18"/>
+                <w:szCs w:val="18"/>
+                <w:lang w:eastAsia="es-MX"/>
+              </w:rPr>
+              <w:t>descripcion_gas_inflamable</w:t>
+            </w:r>
             <w:r>
               <w:rPr>
                 <w:rFonts w:ascii="Calibri" w:eastAsia="Times New Roman" w:hAnsi="Calibri" w:cs="Calibri"/>
@@ -2188,49 +1916,15 @@
                 <w:lang w:eastAsia="es-MX"/>
               </w:rPr>
             </w:pPr>
-            <w:proofErr w:type="gramStart"/>
-            <w:r>
-              <w:rPr>
-                <w:rFonts w:ascii="Calibri" w:eastAsia="Times New Roman" w:hAnsi="Calibri" w:cs="Calibri"/>
-                <w:color w:val="000000"/>
-                <w:sz w:val="18"/>
-                <w:szCs w:val="18"/>
-                <w:lang w:eastAsia="es-MX"/>
-              </w:rPr>
-              <w:t xml:space="preserve">{{ </w:t>
-            </w:r>
-            <w:proofErr w:type="spellStart"/>
-            <w:r>
-              <w:rPr>
-                <w:rFonts w:ascii="Calibri" w:eastAsia="Times New Roman" w:hAnsi="Calibri" w:cs="Calibri"/>
-                <w:color w:val="000000"/>
-                <w:sz w:val="18"/>
-                <w:szCs w:val="18"/>
-                <w:lang w:eastAsia="es-MX"/>
-              </w:rPr>
-              <w:t>gas</w:t>
-            </w:r>
-            <w:proofErr w:type="gramEnd"/>
-            <w:r>
-              <w:rPr>
-                <w:rFonts w:ascii="Calibri" w:eastAsia="Times New Roman" w:hAnsi="Calibri" w:cs="Calibri"/>
-                <w:color w:val="000000"/>
-                <w:sz w:val="18"/>
-                <w:szCs w:val="18"/>
-                <w:lang w:eastAsia="es-MX"/>
-              </w:rPr>
-              <w:t>_inflamable</w:t>
-            </w:r>
-            <w:proofErr w:type="spellEnd"/>
-            <w:r>
-              <w:rPr>
-                <w:rFonts w:ascii="Calibri" w:eastAsia="Times New Roman" w:hAnsi="Calibri" w:cs="Calibri"/>
-                <w:color w:val="000000"/>
-                <w:sz w:val="18"/>
-                <w:szCs w:val="18"/>
-                <w:lang w:eastAsia="es-MX"/>
-              </w:rPr>
-              <w:t xml:space="preserve"> }}</w:t>
+            <w:r>
+              <w:rPr>
+                <w:rFonts w:ascii="Calibri" w:eastAsia="Times New Roman" w:hAnsi="Calibri" w:cs="Calibri"/>
+                <w:color w:val="000000"/>
+                <w:sz w:val="18"/>
+                <w:szCs w:val="18"/>
+                <w:lang w:eastAsia="es-MX"/>
+              </w:rPr>
+              <w:t>{{ gas_inflamable }}</w:t>
             </w:r>
           </w:p>
         </w:tc>
@@ -2260,7 +1954,6 @@
                 <w:lang w:eastAsia="es-MX"/>
               </w:rPr>
             </w:pPr>
-            <w:proofErr w:type="spellStart"/>
             <w:r>
               <w:rPr>
                 <w:rFonts w:ascii="Calibri" w:eastAsia="Times New Roman" w:hAnsi="Calibri" w:cs="Calibri"/>
@@ -2271,7 +1964,6 @@
               </w:rPr>
               <w:t>Lt</w:t>
             </w:r>
-            <w:proofErr w:type="spellEnd"/>
           </w:p>
         </w:tc>
       </w:tr>
@@ -2522,7 +2214,6 @@
                 <w:lang w:eastAsia="es-MX"/>
               </w:rPr>
             </w:pPr>
-            <w:proofErr w:type="gramStart"/>
             <w:r>
               <w:rPr>
                 <w:rFonts w:ascii="Calibri" w:eastAsia="Times New Roman" w:hAnsi="Calibri" w:cs="Calibri"/>
@@ -2533,29 +2224,16 @@
               </w:rPr>
               <w:t xml:space="preserve">{{ </w:t>
             </w:r>
-            <w:proofErr w:type="spellStart"/>
-            <w:r>
-              <w:rPr>
-                <w:rFonts w:ascii="Calibri" w:eastAsia="Times New Roman" w:hAnsi="Calibri" w:cs="Calibri"/>
-                <w:color w:val="000000"/>
-                <w:sz w:val="18"/>
-                <w:szCs w:val="18"/>
-                <w:lang w:eastAsia="es-MX"/>
-              </w:rPr>
-              <w:t>descripcion</w:t>
-            </w:r>
-            <w:proofErr w:type="gramEnd"/>
-            <w:r>
-              <w:rPr>
-                <w:rFonts w:ascii="Calibri" w:eastAsia="Times New Roman" w:hAnsi="Calibri" w:cs="Calibri"/>
-                <w:color w:val="000000"/>
-                <w:sz w:val="18"/>
-                <w:szCs w:val="18"/>
-                <w:lang w:eastAsia="es-MX"/>
-              </w:rPr>
-              <w:t>_liquido_inflamable</w:t>
-            </w:r>
-            <w:proofErr w:type="spellEnd"/>
+            <w:r>
+              <w:rPr>
+                <w:rFonts w:ascii="Calibri" w:eastAsia="Times New Roman" w:hAnsi="Calibri" w:cs="Calibri"/>
+                <w:color w:val="000000"/>
+                <w:sz w:val="18"/>
+                <w:szCs w:val="18"/>
+                <w:lang w:eastAsia="es-MX"/>
+              </w:rPr>
+              <w:t>descripcion_liquido_inflamable</w:t>
+            </w:r>
             <w:r>
               <w:rPr>
                 <w:rFonts w:ascii="Calibri" w:eastAsia="Times New Roman" w:hAnsi="Calibri" w:cs="Calibri"/>
@@ -2595,49 +2273,15 @@
                 <w:lang w:eastAsia="es-MX"/>
               </w:rPr>
             </w:pPr>
-            <w:proofErr w:type="gramStart"/>
-            <w:r>
-              <w:rPr>
-                <w:rFonts w:ascii="Calibri" w:eastAsia="Times New Roman" w:hAnsi="Calibri" w:cs="Calibri"/>
-                <w:color w:val="000000"/>
-                <w:sz w:val="18"/>
-                <w:szCs w:val="18"/>
-                <w:lang w:eastAsia="es-MX"/>
-              </w:rPr>
-              <w:t xml:space="preserve">{{ </w:t>
-            </w:r>
-            <w:proofErr w:type="spellStart"/>
-            <w:r>
-              <w:rPr>
-                <w:rFonts w:ascii="Calibri" w:eastAsia="Times New Roman" w:hAnsi="Calibri" w:cs="Calibri"/>
-                <w:color w:val="000000"/>
-                <w:sz w:val="18"/>
-                <w:szCs w:val="18"/>
-                <w:lang w:eastAsia="es-MX"/>
-              </w:rPr>
-              <w:t>liquido</w:t>
-            </w:r>
-            <w:proofErr w:type="gramEnd"/>
-            <w:r>
-              <w:rPr>
-                <w:rFonts w:ascii="Calibri" w:eastAsia="Times New Roman" w:hAnsi="Calibri" w:cs="Calibri"/>
-                <w:color w:val="000000"/>
-                <w:sz w:val="18"/>
-                <w:szCs w:val="18"/>
-                <w:lang w:eastAsia="es-MX"/>
-              </w:rPr>
-              <w:t>_inflamable</w:t>
-            </w:r>
-            <w:proofErr w:type="spellEnd"/>
-            <w:r>
-              <w:rPr>
-                <w:rFonts w:ascii="Calibri" w:eastAsia="Times New Roman" w:hAnsi="Calibri" w:cs="Calibri"/>
-                <w:color w:val="000000"/>
-                <w:sz w:val="18"/>
-                <w:szCs w:val="18"/>
-                <w:lang w:eastAsia="es-MX"/>
-              </w:rPr>
-              <w:t xml:space="preserve"> }}</w:t>
+            <w:r>
+              <w:rPr>
+                <w:rFonts w:ascii="Calibri" w:eastAsia="Times New Roman" w:hAnsi="Calibri" w:cs="Calibri"/>
+                <w:color w:val="000000"/>
+                <w:sz w:val="18"/>
+                <w:szCs w:val="18"/>
+                <w:lang w:eastAsia="es-MX"/>
+              </w:rPr>
+              <w:t>{{ liquido_inflamable }}</w:t>
             </w:r>
           </w:p>
         </w:tc>
@@ -2667,7 +2311,6 @@
                 <w:lang w:eastAsia="es-MX"/>
               </w:rPr>
             </w:pPr>
-            <w:proofErr w:type="spellStart"/>
             <w:r>
               <w:rPr>
                 <w:rFonts w:ascii="Calibri" w:eastAsia="Times New Roman" w:hAnsi="Calibri" w:cs="Calibri"/>
@@ -2678,7 +2321,6 @@
               </w:rPr>
               <w:t>Lt</w:t>
             </w:r>
-            <w:proofErr w:type="spellEnd"/>
           </w:p>
         </w:tc>
       </w:tr>
@@ -2929,7 +2571,6 @@
                 <w:lang w:eastAsia="es-MX"/>
               </w:rPr>
             </w:pPr>
-            <w:proofErr w:type="gramStart"/>
             <w:r>
               <w:rPr>
                 <w:rFonts w:ascii="Calibri" w:eastAsia="Times New Roman" w:hAnsi="Calibri" w:cs="Calibri"/>
@@ -2940,29 +2581,16 @@
               </w:rPr>
               <w:t xml:space="preserve">{{ </w:t>
             </w:r>
-            <w:proofErr w:type="spellStart"/>
-            <w:r>
-              <w:rPr>
-                <w:rFonts w:ascii="Calibri" w:eastAsia="Times New Roman" w:hAnsi="Calibri" w:cs="Calibri"/>
-                <w:color w:val="000000"/>
-                <w:sz w:val="18"/>
-                <w:szCs w:val="18"/>
-                <w:lang w:eastAsia="es-MX"/>
-              </w:rPr>
-              <w:t>descripcion</w:t>
-            </w:r>
-            <w:proofErr w:type="gramEnd"/>
-            <w:r>
-              <w:rPr>
-                <w:rFonts w:ascii="Calibri" w:eastAsia="Times New Roman" w:hAnsi="Calibri" w:cs="Calibri"/>
-                <w:color w:val="000000"/>
-                <w:sz w:val="18"/>
-                <w:szCs w:val="18"/>
-                <w:lang w:eastAsia="es-MX"/>
-              </w:rPr>
-              <w:t>_liquido_combustible</w:t>
-            </w:r>
-            <w:proofErr w:type="spellEnd"/>
+            <w:r>
+              <w:rPr>
+                <w:rFonts w:ascii="Calibri" w:eastAsia="Times New Roman" w:hAnsi="Calibri" w:cs="Calibri"/>
+                <w:color w:val="000000"/>
+                <w:sz w:val="18"/>
+                <w:szCs w:val="18"/>
+                <w:lang w:eastAsia="es-MX"/>
+              </w:rPr>
+              <w:t>descripcion_liquido_combustible</w:t>
+            </w:r>
             <w:r>
               <w:rPr>
                 <w:rFonts w:ascii="Calibri" w:eastAsia="Times New Roman" w:hAnsi="Calibri" w:cs="Calibri"/>
@@ -3001,49 +2629,15 @@
                 <w:lang w:eastAsia="es-MX"/>
               </w:rPr>
             </w:pPr>
-            <w:proofErr w:type="gramStart"/>
-            <w:r>
-              <w:rPr>
-                <w:rFonts w:ascii="Calibri" w:eastAsia="Times New Roman" w:hAnsi="Calibri" w:cs="Calibri"/>
-                <w:color w:val="000000"/>
-                <w:sz w:val="18"/>
-                <w:szCs w:val="18"/>
-                <w:lang w:eastAsia="es-MX"/>
-              </w:rPr>
-              <w:t xml:space="preserve">{{ </w:t>
-            </w:r>
-            <w:proofErr w:type="spellStart"/>
-            <w:r>
-              <w:rPr>
-                <w:rFonts w:ascii="Calibri" w:eastAsia="Times New Roman" w:hAnsi="Calibri" w:cs="Calibri"/>
-                <w:color w:val="000000"/>
-                <w:sz w:val="18"/>
-                <w:szCs w:val="18"/>
-                <w:lang w:eastAsia="es-MX"/>
-              </w:rPr>
-              <w:t>liquido</w:t>
-            </w:r>
-            <w:proofErr w:type="gramEnd"/>
-            <w:r>
-              <w:rPr>
-                <w:rFonts w:ascii="Calibri" w:eastAsia="Times New Roman" w:hAnsi="Calibri" w:cs="Calibri"/>
-                <w:color w:val="000000"/>
-                <w:sz w:val="18"/>
-                <w:szCs w:val="18"/>
-                <w:lang w:eastAsia="es-MX"/>
-              </w:rPr>
-              <w:t>_combustible</w:t>
-            </w:r>
-            <w:proofErr w:type="spellEnd"/>
-            <w:r>
-              <w:rPr>
-                <w:rFonts w:ascii="Calibri" w:eastAsia="Times New Roman" w:hAnsi="Calibri" w:cs="Calibri"/>
-                <w:color w:val="000000"/>
-                <w:sz w:val="18"/>
-                <w:szCs w:val="18"/>
-                <w:lang w:eastAsia="es-MX"/>
-              </w:rPr>
-              <w:t xml:space="preserve"> }}</w:t>
+            <w:r>
+              <w:rPr>
+                <w:rFonts w:ascii="Calibri" w:eastAsia="Times New Roman" w:hAnsi="Calibri" w:cs="Calibri"/>
+                <w:color w:val="000000"/>
+                <w:sz w:val="18"/>
+                <w:szCs w:val="18"/>
+                <w:lang w:eastAsia="es-MX"/>
+              </w:rPr>
+              <w:t>{{ liquido_combustible }}</w:t>
             </w:r>
           </w:p>
         </w:tc>
@@ -3072,7 +2666,6 @@
                 <w:lang w:eastAsia="es-MX"/>
               </w:rPr>
             </w:pPr>
-            <w:proofErr w:type="spellStart"/>
             <w:r>
               <w:rPr>
                 <w:rFonts w:ascii="Calibri" w:eastAsia="Times New Roman" w:hAnsi="Calibri" w:cs="Calibri"/>
@@ -3083,7 +2676,6 @@
               </w:rPr>
               <w:t>Lt</w:t>
             </w:r>
-            <w:proofErr w:type="spellEnd"/>
           </w:p>
         </w:tc>
       </w:tr>
@@ -3344,7 +2936,6 @@
                 <w:lang w:eastAsia="es-MX"/>
               </w:rPr>
             </w:pPr>
-            <w:proofErr w:type="gramStart"/>
             <w:r>
               <w:rPr>
                 <w:rFonts w:ascii="Calibri" w:eastAsia="Times New Roman" w:hAnsi="Calibri" w:cs="Calibri"/>
@@ -3355,29 +2946,16 @@
               </w:rPr>
               <w:t xml:space="preserve">{{ </w:t>
             </w:r>
-            <w:proofErr w:type="spellStart"/>
-            <w:r>
-              <w:rPr>
-                <w:rFonts w:ascii="Calibri" w:eastAsia="Times New Roman" w:hAnsi="Calibri" w:cs="Calibri"/>
-                <w:color w:val="000000"/>
-                <w:sz w:val="18"/>
-                <w:szCs w:val="18"/>
-                <w:lang w:eastAsia="es-MX"/>
-              </w:rPr>
-              <w:t>descripcion</w:t>
-            </w:r>
-            <w:proofErr w:type="gramEnd"/>
-            <w:r>
-              <w:rPr>
-                <w:rFonts w:ascii="Calibri" w:eastAsia="Times New Roman" w:hAnsi="Calibri" w:cs="Calibri"/>
-                <w:color w:val="000000"/>
-                <w:sz w:val="18"/>
-                <w:szCs w:val="18"/>
-                <w:lang w:eastAsia="es-MX"/>
-              </w:rPr>
-              <w:t>_solido_combustible</w:t>
-            </w:r>
-            <w:proofErr w:type="spellEnd"/>
+            <w:r>
+              <w:rPr>
+                <w:rFonts w:ascii="Calibri" w:eastAsia="Times New Roman" w:hAnsi="Calibri" w:cs="Calibri"/>
+                <w:color w:val="000000"/>
+                <w:sz w:val="18"/>
+                <w:szCs w:val="18"/>
+                <w:lang w:eastAsia="es-MX"/>
+              </w:rPr>
+              <w:t>descripcion_solido_combustible</w:t>
+            </w:r>
             <w:r>
               <w:rPr>
                 <w:rFonts w:ascii="Calibri" w:eastAsia="Times New Roman" w:hAnsi="Calibri" w:cs="Calibri"/>
@@ -3416,38 +2994,15 @@
                 <w:lang w:eastAsia="es-MX"/>
               </w:rPr>
             </w:pPr>
-            <w:proofErr w:type="gramStart"/>
-            <w:r>
-              <w:rPr>
-                <w:rFonts w:ascii="Calibri" w:eastAsia="Times New Roman" w:hAnsi="Calibri" w:cs="Calibri"/>
-                <w:color w:val="000000"/>
-                <w:sz w:val="18"/>
-                <w:szCs w:val="18"/>
-                <w:lang w:eastAsia="es-MX"/>
-              </w:rPr>
-              <w:t xml:space="preserve">{{ </w:t>
-            </w:r>
-            <w:proofErr w:type="spellStart"/>
-            <w:r>
-              <w:rPr>
-                <w:rFonts w:ascii="Calibri" w:eastAsia="Times New Roman" w:hAnsi="Calibri" w:cs="Calibri"/>
-                <w:color w:val="000000"/>
-                <w:sz w:val="18"/>
-                <w:szCs w:val="18"/>
-                <w:lang w:eastAsia="es-MX"/>
-              </w:rPr>
-              <w:t>solido</w:t>
-            </w:r>
-            <w:proofErr w:type="gramEnd"/>
-            <w:r>
-              <w:rPr>
-                <w:rFonts w:ascii="Calibri" w:eastAsia="Times New Roman" w:hAnsi="Calibri" w:cs="Calibri"/>
-                <w:color w:val="000000"/>
-                <w:sz w:val="18"/>
-                <w:szCs w:val="18"/>
-                <w:lang w:eastAsia="es-MX"/>
-              </w:rPr>
-              <w:t>_combus</w:t>
+            <w:r>
+              <w:rPr>
+                <w:rFonts w:ascii="Calibri" w:eastAsia="Times New Roman" w:hAnsi="Calibri" w:cs="Calibri"/>
+                <w:color w:val="000000"/>
+                <w:sz w:val="18"/>
+                <w:szCs w:val="18"/>
+                <w:lang w:eastAsia="es-MX"/>
+              </w:rPr>
+              <w:t>{{ solido_combus</w:t>
             </w:r>
             <w:r>
               <w:rPr>
@@ -3467,18 +3022,7 @@
                 <w:szCs w:val="18"/>
                 <w:lang w:eastAsia="es-MX"/>
               </w:rPr>
-              <w:t>ible</w:t>
-            </w:r>
-            <w:proofErr w:type="spellEnd"/>
-            <w:r>
-              <w:rPr>
-                <w:rFonts w:ascii="Calibri" w:eastAsia="Times New Roman" w:hAnsi="Calibri" w:cs="Calibri"/>
-                <w:color w:val="000000"/>
-                <w:sz w:val="18"/>
-                <w:szCs w:val="18"/>
-                <w:lang w:eastAsia="es-MX"/>
-              </w:rPr>
-              <w:t xml:space="preserve"> }}</w:t>
+              <w:t>ible }}</w:t>
             </w:r>
           </w:p>
         </w:tc>
@@ -3676,7 +3220,6 @@
                 <w:lang w:eastAsia="es-MX"/>
               </w:rPr>
             </w:pPr>
-            <w:proofErr w:type="gramStart"/>
             <w:r>
               <w:rPr>
                 <w:rFonts w:ascii="Calibri" w:eastAsia="Times New Roman" w:hAnsi="Calibri" w:cs="Calibri"/>
@@ -3687,10 +3230,66 @@
                 <w:szCs w:val="18"/>
                 <w:lang w:eastAsia="es-MX"/>
               </w:rPr>
-              <w:t>{{ turnos</w:t>
-            </w:r>
-            <w:proofErr w:type="gramEnd"/>
-            <w:r>
+              <w:t>{{ turnos }}</w:t>
+            </w:r>
+          </w:p>
+        </w:tc>
+        <w:tc>
+          <w:tcPr>
+            <w:tcW w:w="648" w:type="dxa"/>
+            <w:tcBorders>
+              <w:top w:val="single" w:sz="4" w:space="0" w:color="auto"/>
+              <w:left w:val="nil"/>
+              <w:bottom w:val="single" w:sz="4" w:space="0" w:color="auto"/>
+              <w:right w:val="single" w:sz="4" w:space="0" w:color="000000"/>
+            </w:tcBorders>
+            <w:shd w:val="clear" w:color="000000" w:fill="F2F2F2"/>
+            <w:noWrap/>
+            <w:vAlign w:val="center"/>
+            <w:hideMark/>
+          </w:tcPr>
+          <w:p>
+            <w:pPr>
+              <w:spacing w:after="0" w:line="240" w:lineRule="auto"/>
+              <w:jc w:val="center"/>
+              <w:rPr>
+                <w:rFonts w:ascii="Calibri" w:eastAsia="Times New Roman" w:hAnsi="Calibri" w:cs="Calibri"/>
+                <w:color w:val="000000"/>
+                <w:sz w:val="18"/>
+                <w:szCs w:val="18"/>
+                <w:lang w:eastAsia="es-MX"/>
+              </w:rPr>
+            </w:pPr>
+            <w:r>
+              <w:rPr>
+                <w:rFonts w:ascii="Calibri" w:eastAsia="Times New Roman" w:hAnsi="Calibri" w:cs="Calibri"/>
+                <w:color w:val="000000"/>
+                <w:sz w:val="18"/>
+                <w:szCs w:val="18"/>
+                <w:lang w:eastAsia="es-MX"/>
+              </w:rPr>
+              <w:t>Total:</w:t>
+            </w:r>
+          </w:p>
+        </w:tc>
+        <w:tc>
+          <w:tcPr>
+            <w:tcW w:w="813" w:type="dxa"/>
+            <w:tcBorders>
+              <w:top w:val="single" w:sz="4" w:space="0" w:color="auto"/>
+              <w:left w:val="nil"/>
+              <w:bottom w:val="single" w:sz="4" w:space="0" w:color="auto"/>
+              <w:right w:val="single" w:sz="4" w:space="0" w:color="auto"/>
+            </w:tcBorders>
+            <w:shd w:val="clear" w:color="000000" w:fill="FFFF99"/>
+            <w:noWrap/>
+            <w:vAlign w:val="center"/>
+            <w:hideMark/>
+          </w:tcPr>
+          <w:p>
+            <w:pPr>
+              <w:spacing w:after="0" w:line="240" w:lineRule="auto"/>
+              <w:jc w:val="center"/>
               <w:rPr>
                 <w:rFonts w:ascii="Calibri" w:eastAsia="Times New Roman" w:hAnsi="Calibri" w:cs="Calibri"/>
                 <w:b/>
@@ -3700,66 +3299,8 @@
                 <w:szCs w:val="18"/>
                 <w:lang w:eastAsia="es-MX"/>
               </w:rPr>
-              <w:t xml:space="preserve"> }}</w:t>
-            </w:r>
-          </w:p>
-        </w:tc>
-        <w:tc>
-          <w:tcPr>
-            <w:tcW w:w="648" w:type="dxa"/>
-            <w:tcBorders>
-              <w:top w:val="single" w:sz="4" w:space="0" w:color="auto"/>
-              <w:left w:val="nil"/>
-              <w:bottom w:val="single" w:sz="4" w:space="0" w:color="auto"/>
-              <w:right w:val="single" w:sz="4" w:space="0" w:color="000000"/>
-            </w:tcBorders>
-            <w:shd w:val="clear" w:color="000000" w:fill="F2F2F2"/>
-            <w:noWrap/>
-            <w:vAlign w:val="center"/>
-            <w:hideMark/>
-          </w:tcPr>
-          <w:p>
-            <w:pPr>
-              <w:spacing w:after="0" w:line="240" w:lineRule="auto"/>
-              <w:jc w:val="center"/>
-              <w:rPr>
-                <w:rFonts w:ascii="Calibri" w:eastAsia="Times New Roman" w:hAnsi="Calibri" w:cs="Calibri"/>
-                <w:color w:val="000000"/>
-                <w:sz w:val="18"/>
-                <w:szCs w:val="18"/>
-                <w:lang w:eastAsia="es-MX"/>
-              </w:rPr>
-            </w:pPr>
-            <w:r>
-              <w:rPr>
-                <w:rFonts w:ascii="Calibri" w:eastAsia="Times New Roman" w:hAnsi="Calibri" w:cs="Calibri"/>
-                <w:color w:val="000000"/>
-                <w:sz w:val="18"/>
-                <w:szCs w:val="18"/>
-                <w:lang w:eastAsia="es-MX"/>
-              </w:rPr>
-              <w:t>Total:</w:t>
-            </w:r>
-          </w:p>
-        </w:tc>
-        <w:tc>
-          <w:tcPr>
-            <w:tcW w:w="813" w:type="dxa"/>
-            <w:tcBorders>
-              <w:top w:val="single" w:sz="4" w:space="0" w:color="auto"/>
-              <w:left w:val="nil"/>
-              <w:bottom w:val="single" w:sz="4" w:space="0" w:color="auto"/>
-              <w:right w:val="single" w:sz="4" w:space="0" w:color="auto"/>
-            </w:tcBorders>
-            <w:shd w:val="clear" w:color="000000" w:fill="FFFF99"/>
-            <w:noWrap/>
-            <w:vAlign w:val="center"/>
-            <w:hideMark/>
-          </w:tcPr>
-          <w:p>
-            <w:pPr>
-              <w:spacing w:after="0" w:line="240" w:lineRule="auto"/>
-              <w:jc w:val="center"/>
+            </w:pPr>
+            <w:r>
               <w:rPr>
                 <w:rFonts w:ascii="Calibri" w:eastAsia="Times New Roman" w:hAnsi="Calibri" w:cs="Calibri"/>
                 <w:b/>
@@ -3769,9 +3310,68 @@
                 <w:szCs w:val="18"/>
                 <w:lang w:eastAsia="es-MX"/>
               </w:rPr>
-            </w:pPr>
-            <w:proofErr w:type="gramStart"/>
-            <w:r>
+              <w:t>{{ trabajadores }}</w:t>
+            </w:r>
+          </w:p>
+        </w:tc>
+        <w:tc>
+          <w:tcPr>
+            <w:tcW w:w="3527" w:type="dxa"/>
+            <w:gridSpan w:val="4"/>
+            <w:tcBorders>
+              <w:top w:val="single" w:sz="4" w:space="0" w:color="auto"/>
+              <w:left w:val="nil"/>
+              <w:bottom w:val="single" w:sz="4" w:space="0" w:color="auto"/>
+              <w:right w:val="single" w:sz="4" w:space="0" w:color="000000"/>
+            </w:tcBorders>
+            <w:shd w:val="clear" w:color="000000" w:fill="D9D9D9"/>
+            <w:noWrap/>
+            <w:vAlign w:val="center"/>
+            <w:hideMark/>
+          </w:tcPr>
+          <w:p>
+            <w:pPr>
+              <w:spacing w:after="0" w:line="240" w:lineRule="auto"/>
+              <w:jc w:val="center"/>
+              <w:rPr>
+                <w:rFonts w:ascii="Calibri" w:eastAsia="Times New Roman" w:hAnsi="Calibri" w:cs="Calibri"/>
+                <w:color w:val="000000"/>
+                <w:sz w:val="18"/>
+                <w:szCs w:val="18"/>
+                <w:lang w:eastAsia="es-MX"/>
+              </w:rPr>
+            </w:pPr>
+            <w:r>
+              <w:rPr>
+                <w:rFonts w:ascii="Calibri" w:eastAsia="Times New Roman" w:hAnsi="Calibri" w:cs="Calibri"/>
+                <w:color w:val="000000"/>
+                <w:sz w:val="18"/>
+                <w:szCs w:val="18"/>
+                <w:lang w:eastAsia="es-MX"/>
+              </w:rPr>
+              <w:t>Visitantes + contratistas + clientes =</w:t>
+            </w:r>
+          </w:p>
+        </w:tc>
+        <w:tc>
+          <w:tcPr>
+            <w:tcW w:w="1667" w:type="dxa"/>
+            <w:gridSpan w:val="2"/>
+            <w:tcBorders>
+              <w:top w:val="single" w:sz="4" w:space="0" w:color="auto"/>
+              <w:left w:val="nil"/>
+              <w:bottom w:val="single" w:sz="4" w:space="0" w:color="auto"/>
+              <w:right w:val="single" w:sz="4" w:space="0" w:color="auto"/>
+            </w:tcBorders>
+            <w:shd w:val="clear" w:color="000000" w:fill="FFFF99"/>
+            <w:noWrap/>
+            <w:vAlign w:val="center"/>
+            <w:hideMark/>
+          </w:tcPr>
+          <w:p>
+            <w:pPr>
+              <w:spacing w:after="0" w:line="240" w:lineRule="auto"/>
+              <w:jc w:val="center"/>
               <w:rPr>
                 <w:rFonts w:ascii="Calibri" w:eastAsia="Times New Roman" w:hAnsi="Calibri" w:cs="Calibri"/>
                 <w:b/>
@@ -3781,9 +3381,7 @@
                 <w:szCs w:val="18"/>
                 <w:lang w:eastAsia="es-MX"/>
               </w:rPr>
-              <w:t>{{ trabajadores</w:t>
-            </w:r>
-            <w:proofErr w:type="gramEnd"/>
+            </w:pPr>
             <w:r>
               <w:rPr>
                 <w:rFonts w:ascii="Calibri" w:eastAsia="Times New Roman" w:hAnsi="Calibri" w:cs="Calibri"/>
@@ -3794,103 +3392,7 @@
                 <w:szCs w:val="18"/>
                 <w:lang w:eastAsia="es-MX"/>
               </w:rPr>
-              <w:t xml:space="preserve"> }}</w:t>
-            </w:r>
-          </w:p>
-        </w:tc>
-        <w:tc>
-          <w:tcPr>
-            <w:tcW w:w="3527" w:type="dxa"/>
-            <w:gridSpan w:val="4"/>
-            <w:tcBorders>
-              <w:top w:val="single" w:sz="4" w:space="0" w:color="auto"/>
-              <w:left w:val="nil"/>
-              <w:bottom w:val="single" w:sz="4" w:space="0" w:color="auto"/>
-              <w:right w:val="single" w:sz="4" w:space="0" w:color="000000"/>
-            </w:tcBorders>
-            <w:shd w:val="clear" w:color="000000" w:fill="D9D9D9"/>
-            <w:noWrap/>
-            <w:vAlign w:val="center"/>
-            <w:hideMark/>
-          </w:tcPr>
-          <w:p>
-            <w:pPr>
-              <w:spacing w:after="0" w:line="240" w:lineRule="auto"/>
-              <w:jc w:val="center"/>
-              <w:rPr>
-                <w:rFonts w:ascii="Calibri" w:eastAsia="Times New Roman" w:hAnsi="Calibri" w:cs="Calibri"/>
-                <w:color w:val="000000"/>
-                <w:sz w:val="18"/>
-                <w:szCs w:val="18"/>
-                <w:lang w:eastAsia="es-MX"/>
-              </w:rPr>
-            </w:pPr>
-            <w:r>
-              <w:rPr>
-                <w:rFonts w:ascii="Calibri" w:eastAsia="Times New Roman" w:hAnsi="Calibri" w:cs="Calibri"/>
-                <w:color w:val="000000"/>
-                <w:sz w:val="18"/>
-                <w:szCs w:val="18"/>
-                <w:lang w:eastAsia="es-MX"/>
-              </w:rPr>
-              <w:t>Visitantes + contratistas + clientes =</w:t>
-            </w:r>
-          </w:p>
-        </w:tc>
-        <w:tc>
-          <w:tcPr>
-            <w:tcW w:w="1667" w:type="dxa"/>
-            <w:gridSpan w:val="2"/>
-            <w:tcBorders>
-              <w:top w:val="single" w:sz="4" w:space="0" w:color="auto"/>
-              <w:left w:val="nil"/>
-              <w:bottom w:val="single" w:sz="4" w:space="0" w:color="auto"/>
-              <w:right w:val="single" w:sz="4" w:space="0" w:color="auto"/>
-            </w:tcBorders>
-            <w:shd w:val="clear" w:color="000000" w:fill="FFFF99"/>
-            <w:noWrap/>
-            <w:vAlign w:val="center"/>
-            <w:hideMark/>
-          </w:tcPr>
-          <w:p>
-            <w:pPr>
-              <w:spacing w:after="0" w:line="240" w:lineRule="auto"/>
-              <w:jc w:val="center"/>
-              <w:rPr>
-                <w:rFonts w:ascii="Calibri" w:eastAsia="Times New Roman" w:hAnsi="Calibri" w:cs="Calibri"/>
-                <w:b/>
-                <w:bCs/>
-                <w:color w:val="000000"/>
-                <w:sz w:val="18"/>
-                <w:szCs w:val="18"/>
-                <w:lang w:eastAsia="es-MX"/>
-              </w:rPr>
-            </w:pPr>
-            <w:proofErr w:type="gramStart"/>
-            <w:r>
-              <w:rPr>
-                <w:rFonts w:ascii="Calibri" w:eastAsia="Times New Roman" w:hAnsi="Calibri" w:cs="Calibri"/>
-                <w:b/>
-                <w:bCs/>
-                <w:color w:val="000000"/>
-                <w:sz w:val="18"/>
-                <w:szCs w:val="18"/>
-                <w:lang w:eastAsia="es-MX"/>
-              </w:rPr>
-              <w:t>{{ flotante</w:t>
-            </w:r>
-            <w:proofErr w:type="gramEnd"/>
-            <w:r>
-              <w:rPr>
-                <w:rFonts w:ascii="Calibri" w:eastAsia="Times New Roman" w:hAnsi="Calibri" w:cs="Calibri"/>
-                <w:b/>
-                <w:bCs/>
-                <w:color w:val="000000"/>
-                <w:sz w:val="18"/>
-                <w:szCs w:val="18"/>
-                <w:lang w:eastAsia="es-MX"/>
-              </w:rPr>
-              <w:t xml:space="preserve"> }}</w:t>
+              <w:t>{{ flotante }}</w:t>
             </w:r>
           </w:p>
         </w:tc>
@@ -4129,7 +3631,6 @@
                 <w:lang w:eastAsia="es-MX"/>
               </w:rPr>
             </w:pPr>
-            <w:proofErr w:type="gramStart"/>
             <w:r>
               <w:rPr>
                 <w:sz w:val="18"/>
@@ -4137,23 +3638,13 @@
               </w:rPr>
               <w:t xml:space="preserve">{{ </w:t>
             </w:r>
-            <w:proofErr w:type="spellStart"/>
-            <w:r>
-              <w:rPr>
-                <w:sz w:val="18"/>
-                <w:szCs w:val="18"/>
-              </w:rPr>
-              <w:t>valor</w:t>
-            </w:r>
-            <w:proofErr w:type="gramEnd"/>
-            <w:r>
-              <w:rPr>
-                <w:sz w:val="18"/>
-                <w:szCs w:val="18"/>
-              </w:rPr>
-              <w:t>_gas_inflamable</w:t>
-            </w:r>
-            <w:proofErr w:type="spellEnd"/>
+            <w:r>
+              <w:rPr>
+                <w:sz w:val="18"/>
+                <w:szCs w:val="18"/>
+              </w:rPr>
+              <w:t>valor_gas_inflamable</w:t>
+            </w:r>
             <w:r>
               <w:rPr>
                 <w:sz w:val="18"/>
@@ -4272,7 +3763,6 @@
                 <w:lang w:eastAsia="es-MX"/>
               </w:rPr>
             </w:pPr>
-            <w:proofErr w:type="gramStart"/>
             <w:r>
               <w:rPr>
                 <w:sz w:val="18"/>
@@ -4280,23 +3770,13 @@
               </w:rPr>
               <w:t xml:space="preserve">{{ </w:t>
             </w:r>
-            <w:proofErr w:type="spellStart"/>
-            <w:r>
-              <w:rPr>
-                <w:sz w:val="18"/>
-                <w:szCs w:val="18"/>
-              </w:rPr>
-              <w:t>valor</w:t>
-            </w:r>
-            <w:proofErr w:type="gramEnd"/>
-            <w:r>
-              <w:rPr>
-                <w:sz w:val="18"/>
-                <w:szCs w:val="18"/>
-              </w:rPr>
-              <w:t>_liquido_inflamable</w:t>
-            </w:r>
-            <w:proofErr w:type="spellEnd"/>
+            <w:r>
+              <w:rPr>
+                <w:sz w:val="18"/>
+                <w:szCs w:val="18"/>
+              </w:rPr>
+              <w:t>valor_liquido_inflamable</w:t>
+            </w:r>
             <w:r>
               <w:rPr>
                 <w:sz w:val="18"/>
@@ -4415,7 +3895,6 @@
                 <w:lang w:eastAsia="es-MX"/>
               </w:rPr>
             </w:pPr>
-            <w:proofErr w:type="gramStart"/>
             <w:r>
               <w:rPr>
                 <w:rFonts w:ascii="Calibri" w:eastAsia="Times New Roman" w:hAnsi="Calibri" w:cs="Calibri"/>
@@ -4426,29 +3905,16 @@
               </w:rPr>
               <w:t xml:space="preserve">{{ </w:t>
             </w:r>
-            <w:proofErr w:type="spellStart"/>
-            <w:r>
-              <w:rPr>
-                <w:rFonts w:ascii="Calibri" w:eastAsia="Times New Roman" w:hAnsi="Calibri" w:cs="Calibri"/>
-                <w:color w:val="000000"/>
-                <w:sz w:val="18"/>
-                <w:szCs w:val="18"/>
-                <w:lang w:eastAsia="es-MX"/>
-              </w:rPr>
-              <w:t>valor</w:t>
-            </w:r>
-            <w:proofErr w:type="gramEnd"/>
-            <w:r>
-              <w:rPr>
-                <w:rFonts w:ascii="Calibri" w:eastAsia="Times New Roman" w:hAnsi="Calibri" w:cs="Calibri"/>
-                <w:color w:val="000000"/>
-                <w:sz w:val="18"/>
-                <w:szCs w:val="18"/>
-                <w:lang w:eastAsia="es-MX"/>
-              </w:rPr>
-              <w:t>_liquido_combustible</w:t>
-            </w:r>
-            <w:proofErr w:type="spellEnd"/>
+            <w:r>
+              <w:rPr>
+                <w:rFonts w:ascii="Calibri" w:eastAsia="Times New Roman" w:hAnsi="Calibri" w:cs="Calibri"/>
+                <w:color w:val="000000"/>
+                <w:sz w:val="18"/>
+                <w:szCs w:val="18"/>
+                <w:lang w:eastAsia="es-MX"/>
+              </w:rPr>
+              <w:t>valor_liquido_combustible</w:t>
+            </w:r>
             <w:r>
               <w:rPr>
                 <w:rFonts w:ascii="Calibri" w:eastAsia="Times New Roman" w:hAnsi="Calibri" w:cs="Calibri"/>
@@ -4570,7 +4036,6 @@
                 <w:lang w:eastAsia="es-MX"/>
               </w:rPr>
             </w:pPr>
-            <w:proofErr w:type="gramStart"/>
             <w:r>
               <w:rPr>
                 <w:sz w:val="18"/>
@@ -4578,23 +4043,13 @@
               </w:rPr>
               <w:t xml:space="preserve">{{ </w:t>
             </w:r>
-            <w:proofErr w:type="spellStart"/>
-            <w:r>
-              <w:rPr>
-                <w:sz w:val="18"/>
-                <w:szCs w:val="18"/>
-              </w:rPr>
-              <w:t>valor</w:t>
-            </w:r>
-            <w:proofErr w:type="gramEnd"/>
-            <w:r>
-              <w:rPr>
-                <w:sz w:val="18"/>
-                <w:szCs w:val="18"/>
-              </w:rPr>
-              <w:t>_solido_combustible</w:t>
-            </w:r>
-            <w:proofErr w:type="spellEnd"/>
+            <w:r>
+              <w:rPr>
+                <w:sz w:val="18"/>
+                <w:szCs w:val="18"/>
+              </w:rPr>
+              <w:t>valor_solido_combustible</w:t>
+            </w:r>
             <w:r>
               <w:rPr>
                 <w:sz w:val="18"/>
@@ -4834,33 +4289,13 @@
                 <w:lang w:eastAsia="es-MX"/>
               </w:rPr>
             </w:pPr>
-            <w:proofErr w:type="gramStart"/>
-            <w:r>
-              <w:rPr>
-                <w:rFonts w:ascii="Calibri" w:eastAsia="Times New Roman" w:hAnsi="Calibri" w:cs="Calibri"/>
-                <w:color w:val="000000"/>
-                <w:lang w:eastAsia="es-MX"/>
-              </w:rPr>
-              <w:t xml:space="preserve">{{ </w:t>
-            </w:r>
-            <w:proofErr w:type="spellStart"/>
-            <w:r>
-              <w:rPr>
-                <w:rFonts w:ascii="Calibri" w:eastAsia="Times New Roman" w:hAnsi="Calibri" w:cs="Calibri"/>
-                <w:color w:val="000000"/>
-                <w:lang w:eastAsia="es-MX"/>
-              </w:rPr>
-              <w:t>dia</w:t>
-            </w:r>
-            <w:proofErr w:type="spellEnd"/>
-            <w:proofErr w:type="gramEnd"/>
-            <w:r>
-              <w:rPr>
-                <w:rFonts w:ascii="Calibri" w:eastAsia="Times New Roman" w:hAnsi="Calibri" w:cs="Calibri"/>
-                <w:color w:val="000000"/>
-                <w:lang w:eastAsia="es-MX"/>
-              </w:rPr>
-              <w:t xml:space="preserve"> }}</w:t>
+            <w:r>
+              <w:rPr>
+                <w:rFonts w:ascii="Calibri" w:eastAsia="Times New Roman" w:hAnsi="Calibri" w:cs="Calibri"/>
+                <w:color w:val="000000"/>
+                <w:lang w:eastAsia="es-MX"/>
+              </w:rPr>
+              <w:t>{{ dia }}</w:t>
             </w:r>
             <w:r>
               <w:rPr>
@@ -4892,25 +4327,7 @@
                 <w:color w:val="000000"/>
                 <w:lang w:eastAsia="es-MX"/>
               </w:rPr>
-              <w:t xml:space="preserve">{{ </w:t>
-            </w:r>
-            <w:proofErr w:type="spellStart"/>
-            <w:r>
-              <w:rPr>
-                <w:rFonts w:ascii="Calibri" w:eastAsia="Times New Roman" w:hAnsi="Calibri" w:cs="Calibri"/>
-                <w:color w:val="000000"/>
-                <w:lang w:eastAsia="es-MX"/>
-              </w:rPr>
-              <w:t>anio</w:t>
-            </w:r>
-            <w:proofErr w:type="spellEnd"/>
-            <w:r>
-              <w:rPr>
-                <w:rFonts w:ascii="Calibri" w:eastAsia="Times New Roman" w:hAnsi="Calibri" w:cs="Calibri"/>
-                <w:color w:val="000000"/>
-                <w:lang w:eastAsia="es-MX"/>
-              </w:rPr>
-              <w:t xml:space="preserve"> }}</w:t>
+              <w:t>{{ anio }}</w:t>
             </w:r>
           </w:p>
         </w:tc>
@@ -4941,27 +4358,15 @@
                 <w:lang w:eastAsia="es-MX"/>
               </w:rPr>
             </w:pPr>
-            <w:proofErr w:type="spellStart"/>
-            <w:r>
-              <w:rPr>
-                <w:rFonts w:ascii="Calibri" w:eastAsia="Times New Roman" w:hAnsi="Calibri" w:cs="Calibri"/>
-                <w:color w:val="000000"/>
-                <w:sz w:val="18"/>
-                <w:szCs w:val="18"/>
-                <w:lang w:eastAsia="es-MX"/>
-              </w:rPr>
-              <w:t>Sup</w:t>
-            </w:r>
-            <w:proofErr w:type="spellEnd"/>
-            <w:r>
-              <w:rPr>
-                <w:rFonts w:ascii="Calibri" w:eastAsia="Times New Roman" w:hAnsi="Calibri" w:cs="Calibri"/>
-                <w:color w:val="000000"/>
-                <w:sz w:val="18"/>
-                <w:szCs w:val="18"/>
-                <w:lang w:eastAsia="es-MX"/>
-              </w:rPr>
-              <w:t>. Construida (m2):</w:t>
+            <w:r>
+              <w:rPr>
+                <w:rFonts w:ascii="Calibri" w:eastAsia="Times New Roman" w:hAnsi="Calibri" w:cs="Calibri"/>
+                <w:color w:val="000000"/>
+                <w:sz w:val="18"/>
+                <w:szCs w:val="18"/>
+                <w:lang w:eastAsia="es-MX"/>
+              </w:rPr>
+              <w:t>Sup. Construida (m2):</w:t>
             </w:r>
           </w:p>
         </w:tc>
@@ -4990,23 +4395,13 @@
                 <w:lang w:eastAsia="es-MX"/>
               </w:rPr>
             </w:pPr>
-            <w:proofErr w:type="gramStart"/>
-            <w:r>
-              <w:rPr>
-                <w:rFonts w:ascii="Calibri" w:eastAsia="Times New Roman" w:hAnsi="Calibri" w:cs="Calibri"/>
-                <w:color w:val="000000"/>
-                <w:lang w:eastAsia="es-MX"/>
-              </w:rPr>
-              <w:t>{{ construccion</w:t>
-            </w:r>
-            <w:proofErr w:type="gramEnd"/>
-            <w:r>
-              <w:rPr>
-                <w:rFonts w:ascii="Calibri" w:eastAsia="Times New Roman" w:hAnsi="Calibri" w:cs="Calibri"/>
-                <w:color w:val="000000"/>
-                <w:lang w:eastAsia="es-MX"/>
-              </w:rPr>
-              <w:t>_m2 }}</w:t>
+            <w:r>
+              <w:rPr>
+                <w:rFonts w:ascii="Calibri" w:eastAsia="Times New Roman" w:hAnsi="Calibri" w:cs="Calibri"/>
+                <w:color w:val="000000"/>
+                <w:lang w:eastAsia="es-MX"/>
+              </w:rPr>
+              <w:t>{{ construccion_m2 }}</w:t>
             </w:r>
           </w:p>
         </w:tc>
@@ -5094,7 +4489,6 @@
                 <w:lang w:eastAsia="es-MX"/>
               </w:rPr>
             </w:pPr>
-            <w:proofErr w:type="gramStart"/>
             <w:r>
               <w:rPr>
                 <w:rFonts w:ascii="Calibri" w:eastAsia="Times New Roman" w:hAnsi="Calibri" w:cs="Calibri"/>
@@ -5105,46 +4499,7 @@
                 <w:szCs w:val="18"/>
                 <w:lang w:eastAsia="es-MX"/>
               </w:rPr>
-              <w:t xml:space="preserve">{{ </w:t>
-            </w:r>
-            <w:proofErr w:type="spellStart"/>
-            <w:r>
-              <w:rPr>
-                <w:rFonts w:ascii="Calibri" w:eastAsia="Times New Roman" w:hAnsi="Calibri" w:cs="Calibri"/>
-                <w:b/>
-                <w:bCs/>
-                <w:color w:val="FF0000"/>
-                <w:sz w:val="18"/>
-                <w:szCs w:val="18"/>
-                <w:lang w:eastAsia="es-MX"/>
-              </w:rPr>
-              <w:t>tipo</w:t>
-            </w:r>
-            <w:proofErr w:type="gramEnd"/>
-            <w:r>
-              <w:rPr>
-                <w:rFonts w:ascii="Calibri" w:eastAsia="Times New Roman" w:hAnsi="Calibri" w:cs="Calibri"/>
-                <w:b/>
-                <w:bCs/>
-                <w:color w:val="FF0000"/>
-                <w:sz w:val="18"/>
-                <w:szCs w:val="18"/>
-                <w:lang w:eastAsia="es-MX"/>
-              </w:rPr>
-              <w:t>_riesgo</w:t>
-            </w:r>
-            <w:proofErr w:type="spellEnd"/>
-            <w:r>
-              <w:rPr>
-                <w:rFonts w:ascii="Calibri" w:eastAsia="Times New Roman" w:hAnsi="Calibri" w:cs="Calibri"/>
-                <w:b/>
-                <w:bCs/>
-                <w:color w:val="FF0000"/>
-                <w:sz w:val="18"/>
-                <w:szCs w:val="18"/>
-                <w:lang w:eastAsia="es-MX"/>
-              </w:rPr>
-              <w:t xml:space="preserve"> }}</w:t>
+              <w:t>{{ tipo_riesgo }}</w:t>
             </w:r>
           </w:p>
         </w:tc>
@@ -5439,7 +4794,6 @@
               </w:rPr>
               <w:t xml:space="preserve"> </w:t>
             </w:r>
-            <w:proofErr w:type="gramStart"/>
             <w:r>
               <w:rPr>
                 <w:rFonts w:ascii="Calibri" w:eastAsia="Times New Roman" w:hAnsi="Calibri" w:cs="Calibri"/>
@@ -5450,46 +4804,7 @@
                 <w:szCs w:val="28"/>
                 <w:lang w:eastAsia="es-MX"/>
               </w:rPr>
-              <w:t xml:space="preserve">{{ </w:t>
-            </w:r>
-            <w:proofErr w:type="spellStart"/>
-            <w:r>
-              <w:rPr>
-                <w:rFonts w:ascii="Calibri" w:eastAsia="Times New Roman" w:hAnsi="Calibri" w:cs="Calibri"/>
-                <w:b/>
-                <w:bCs/>
-                <w:color w:val="000000"/>
-                <w:sz w:val="28"/>
-                <w:szCs w:val="28"/>
-                <w:lang w:eastAsia="es-MX"/>
-              </w:rPr>
-              <w:t>giro</w:t>
-            </w:r>
-            <w:proofErr w:type="gramEnd"/>
-            <w:r>
-              <w:rPr>
-                <w:rFonts w:ascii="Calibri" w:eastAsia="Times New Roman" w:hAnsi="Calibri" w:cs="Calibri"/>
-                <w:b/>
-                <w:bCs/>
-                <w:color w:val="000000"/>
-                <w:sz w:val="28"/>
-                <w:szCs w:val="28"/>
-                <w:lang w:eastAsia="es-MX"/>
-              </w:rPr>
-              <w:t>_comercial</w:t>
-            </w:r>
-            <w:proofErr w:type="spellEnd"/>
-            <w:r>
-              <w:rPr>
-                <w:rFonts w:ascii="Calibri" w:eastAsia="Times New Roman" w:hAnsi="Calibri" w:cs="Calibri"/>
-                <w:b/>
-                <w:bCs/>
-                <w:color w:val="000000"/>
-                <w:sz w:val="28"/>
-                <w:szCs w:val="28"/>
-                <w:lang w:eastAsia="es-MX"/>
-              </w:rPr>
-              <w:t xml:space="preserve"> }}</w:t>
+              <w:t>{{ giro_comercial }}</w:t>
             </w:r>
           </w:p>
         </w:tc>
@@ -5764,27 +5079,15 @@
                 <w:lang w:eastAsia="es-MX"/>
               </w:rPr>
             </w:pPr>
-            <w:proofErr w:type="gramStart"/>
-            <w:r>
-              <w:rPr>
-                <w:rFonts w:ascii="Calibri" w:eastAsia="Times New Roman" w:hAnsi="Calibri" w:cs="Calibri"/>
-                <w:color w:val="000000"/>
-                <w:sz w:val="18"/>
-                <w:szCs w:val="18"/>
-                <w:lang w:eastAsia="es-MX"/>
-              </w:rPr>
-              <w:t>{{ cocina</w:t>
-            </w:r>
-            <w:proofErr w:type="gramEnd"/>
-            <w:r>
-              <w:rPr>
-                <w:rFonts w:ascii="Calibri" w:eastAsia="Times New Roman" w:hAnsi="Calibri" w:cs="Calibri"/>
-                <w:color w:val="000000"/>
-                <w:sz w:val="18"/>
-                <w:szCs w:val="18"/>
-                <w:lang w:eastAsia="es-MX"/>
-              </w:rPr>
-              <w:t xml:space="preserve"> }}</w:t>
+            <w:r>
+              <w:rPr>
+                <w:rFonts w:ascii="Calibri" w:eastAsia="Times New Roman" w:hAnsi="Calibri" w:cs="Calibri"/>
+                <w:color w:val="000000"/>
+                <w:sz w:val="18"/>
+                <w:szCs w:val="18"/>
+                <w:lang w:eastAsia="es-MX"/>
+              </w:rPr>
+              <w:t>{{ cocina }}</w:t>
             </w:r>
           </w:p>
         </w:tc>
@@ -6402,41 +5705,13 @@
                 <w:lang w:eastAsia="es-MX"/>
               </w:rPr>
             </w:pPr>
-            <w:proofErr w:type="gramStart"/>
-            <w:r>
-              <w:rPr>
-                <w:rFonts w:ascii="Calibri" w:eastAsia="Times New Roman" w:hAnsi="Calibri" w:cs="Calibri"/>
-                <w:color w:val="000000"/>
-                <w:lang w:eastAsia="es-MX"/>
-              </w:rPr>
-              <w:t xml:space="preserve">{{ </w:t>
-            </w:r>
-            <w:proofErr w:type="spellStart"/>
-            <w:r>
-              <w:rPr>
-                <w:rFonts w:ascii="Calibri" w:eastAsia="Times New Roman" w:hAnsi="Calibri" w:cs="Calibri"/>
-                <w:color w:val="000000"/>
-                <w:lang w:eastAsia="es-MX"/>
-              </w:rPr>
-              <w:t>observaciones</w:t>
-            </w:r>
-            <w:proofErr w:type="gramEnd"/>
-            <w:r>
-              <w:rPr>
-                <w:rFonts w:ascii="Calibri" w:eastAsia="Times New Roman" w:hAnsi="Calibri" w:cs="Calibri"/>
-                <w:color w:val="000000"/>
-                <w:lang w:eastAsia="es-MX"/>
-              </w:rPr>
-              <w:t>_k</w:t>
-            </w:r>
-            <w:proofErr w:type="spellEnd"/>
-            <w:r>
-              <w:rPr>
-                <w:rFonts w:ascii="Calibri" w:eastAsia="Times New Roman" w:hAnsi="Calibri" w:cs="Calibri"/>
-                <w:color w:val="000000"/>
-                <w:lang w:eastAsia="es-MX"/>
-              </w:rPr>
-              <w:t xml:space="preserve"> }}</w:t>
+            <w:r>
+              <w:rPr>
+                <w:rFonts w:ascii="Calibri" w:eastAsia="Times New Roman" w:hAnsi="Calibri" w:cs="Calibri"/>
+                <w:color w:val="000000"/>
+                <w:lang w:eastAsia="es-MX"/>
+              </w:rPr>
+              <w:t>{{ observaciones_k }}</w:t>
             </w:r>
           </w:p>
         </w:tc>
@@ -6737,23 +6012,13 @@
                 <w:lang w:eastAsia="es-MX"/>
               </w:rPr>
             </w:pPr>
-            <w:proofErr w:type="gramStart"/>
-            <w:r>
-              <w:rPr>
-                <w:rFonts w:ascii="Calibri" w:eastAsia="Times New Roman" w:hAnsi="Calibri" w:cs="Calibri"/>
-                <w:color w:val="000000"/>
-                <w:lang w:eastAsia="es-MX"/>
-              </w:rPr>
-              <w:t>{{ extintor</w:t>
-            </w:r>
-            <w:proofErr w:type="gramEnd"/>
-            <w:r>
-              <w:rPr>
-                <w:rFonts w:ascii="Calibri" w:eastAsia="Times New Roman" w:hAnsi="Calibri" w:cs="Calibri"/>
-                <w:color w:val="000000"/>
-                <w:lang w:eastAsia="es-MX"/>
-              </w:rPr>
-              <w:t xml:space="preserve"> }}</w:t>
+            <w:r>
+              <w:rPr>
+                <w:rFonts w:ascii="Calibri" w:eastAsia="Times New Roman" w:hAnsi="Calibri" w:cs="Calibri"/>
+                <w:color w:val="000000"/>
+                <w:lang w:eastAsia="es-MX"/>
+              </w:rPr>
+              <w:t>{{ extintor }}</w:t>
             </w:r>
           </w:p>
         </w:tc>
@@ -8123,7 +7388,6 @@
                 <w:lang w:eastAsia="es-MX"/>
               </w:rPr>
             </w:pPr>
-            <w:proofErr w:type="gramStart"/>
             <w:r>
               <w:rPr>
                 <w:rFonts w:ascii="Calibri" w:eastAsia="Times New Roman" w:hAnsi="Calibri" w:cs="Calibri"/>
@@ -8132,40 +7396,7 @@
                 <w:color w:val="000000"/>
                 <w:lang w:eastAsia="es-MX"/>
               </w:rPr>
-              <w:t xml:space="preserve">{{ </w:t>
-            </w:r>
-            <w:proofErr w:type="spellStart"/>
-            <w:r>
-              <w:rPr>
-                <w:rFonts w:ascii="Calibri" w:eastAsia="Times New Roman" w:hAnsi="Calibri" w:cs="Calibri"/>
-                <w:b/>
-                <w:bCs/>
-                <w:color w:val="000000"/>
-                <w:lang w:eastAsia="es-MX"/>
-              </w:rPr>
-              <w:t>ext</w:t>
-            </w:r>
-            <w:proofErr w:type="gramEnd"/>
-            <w:r>
-              <w:rPr>
-                <w:rFonts w:ascii="Calibri" w:eastAsia="Times New Roman" w:hAnsi="Calibri" w:cs="Calibri"/>
-                <w:b/>
-                <w:bCs/>
-                <w:color w:val="000000"/>
-                <w:lang w:eastAsia="es-MX"/>
-              </w:rPr>
-              <w:t>_distancia</w:t>
-            </w:r>
-            <w:proofErr w:type="spellEnd"/>
-            <w:r>
-              <w:rPr>
-                <w:rFonts w:ascii="Calibri" w:eastAsia="Times New Roman" w:hAnsi="Calibri" w:cs="Calibri"/>
-                <w:b/>
-                <w:bCs/>
-                <w:color w:val="000000"/>
-                <w:lang w:eastAsia="es-MX"/>
-              </w:rPr>
-              <w:t xml:space="preserve"> }}</w:t>
+              <w:t>{{ ext_distancia }}</w:t>
             </w:r>
             <w:r>
               <w:rPr>

</xml_diff>